<commit_message>
LA-2 report and deck: GitHub screenshot cropped to the repository header and file list
Co-Authored-By: Claude Opus 5.5 <noreply@anthropic.com>
</commit_message>
<xml_diff>
--- a/deliverables/LA2/MP1_Report_PromptOpt.docx
+++ b/deliverables/LA2/MP1_Report_PromptOpt.docx
@@ -3360,7 +3360,7 @@
           <w:sz w:val="21"/>
         </w:rPr>
         <w:tab/>
-        <w:t>40</w:t>
+        <w:t>39</w:t>
       </w:r>
     </w:p>
     <w:p>
@@ -4295,7 +4295,7 @@
           <w:sz w:val="20"/>
         </w:rPr>
         <w:tab/>
-        <w:t>38</w:t>
+        <w:t>37</w:t>
       </w:r>
     </w:p>
     <w:p>
@@ -4351,7 +4351,7 @@
           <w:sz w:val="20"/>
         </w:rPr>
         <w:tab/>
-        <w:t>39</w:t>
+        <w:t>38</w:t>
       </w:r>
     </w:p>
     <w:p>
@@ -4379,7 +4379,7 @@
           <w:sz w:val="20"/>
         </w:rPr>
         <w:tab/>
-        <w:t>40</w:t>
+        <w:t>39</w:t>
       </w:r>
     </w:p>
     <w:p>
@@ -22739,7 +22739,7 @@
       <w:r>
         <w:drawing>
           <wp:inline xmlns:a="http://schemas.openxmlformats.org/drawingml/2006/main" xmlns:pic="http://schemas.openxmlformats.org/drawingml/2006/picture">
-            <wp:extent cx="5303520" cy="3729038"/>
+            <wp:extent cx="5303520" cy="2939370"/>
             <wp:docPr id="405" name="Picture 405"/>
             <wp:cNvGraphicFramePr>
               <a:graphicFrameLocks noChangeAspect="1"/>
@@ -22760,7 +22760,7 @@
                   <pic:spPr>
                     <a:xfrm>
                       <a:off x="0" y="0"/>
-                      <a:ext cx="5303520" cy="3729038"/>
+                      <a:ext cx="5303520" cy="2939370"/>
                     </a:xfrm>
                     <a:prstGeom prst="rect"/>
                   </pic:spPr>

</xml_diff>